<commit_message>
Align editorial team and add ACC NotebookLM pack
</commit_message>
<xml_diff>
--- a/18_DOCX/ACC_CASES_0001_0002.docx
+++ b/18_DOCX/ACC_CASES_0001_0002.docx
@@ -47,7 +47,7 @@
         <w:pStyle w:val="ListBullet"/>
       </w:pPr>
       <w:r>
-        <w:t>Histórico: Consolidação editorial do segundo lote ACC.</w:t>
+        <w:t>Histórico: Consolidação editorial do segundo lote ACC; título do CASE-ACC-0002 normalizado.</w:t>
       </w:r>
     </w:p>
     <w:p>
@@ -546,7 +546,7 @@
         <w:pStyle w:val="Heading1"/>
       </w:pPr>
       <w:r>
-        <w:t>CASE-ACC-0002 - Internação por acidente com免責日数</w:t>
+        <w:t>CASE-ACC-0002 - 事故入院と免責日数の説明</w:t>
       </w:r>
     </w:p>
     <w:p>
@@ -1473,7 +1473,7 @@
       <w:b/>
       <w:bCs/>
       <w:color w:val="4F81BD" w:themeColor="accent1"/>
-      <w:sz w:val="26"/>
+      <w:sz w:val="22"/>
     </w:rPr>
   </w:style>
   <w:style w:type="paragraph" w:styleId="Heading4">
@@ -1493,12 +1493,13 @@
       <w:outlineLvl w:val="3"/>
     </w:pPr>
     <w:rPr>
-      <w:rFonts w:asciiTheme="majorHAnsi" w:eastAsiaTheme="majorEastAsia" w:hAnsiTheme="majorHAnsi" w:cstheme="majorBidi"/>
+      <w:rFonts w:asciiTheme="majorHAnsi" w:eastAsiaTheme="majorEastAsia" w:hAnsiTheme="majorHAnsi" w:cstheme="majorBidi" w:ascii="Noto Sans CJK JP" w:hAnsi="Noto Sans CJK JP" w:eastAsia="Noto Sans CJK JP"/>
       <w:b/>
       <w:bCs/>
       <w:i/>
       <w:iCs/>
       <w:color w:val="4F81BD" w:themeColor="accent1"/>
+      <w:sz w:val="22"/>
     </w:rPr>
   </w:style>
   <w:style w:type="paragraph" w:styleId="Heading5">

</xml_diff>